<commit_message>
Wrapping up my day
</commit_message>
<xml_diff>
--- a/accounts/cardinal-health/CardinalHealth Sonexus AI Workshop Proposal.docx
+++ b/accounts/cardinal-health/CardinalHealth Sonexus AI Workshop Proposal.docx
@@ -104,12 +104,6 @@
         <w:gridCol w:w="7360"/>
       </w:tblGrid>
       <w:tr>
-        <w:tblPrEx>
-          <w:tblCellMar>
-            <w:top w:w="0" w:type="dxa"/>
-            <w:bottom w:w="0" w:type="dxa"/>
-          </w:tblCellMar>
-        </w:tblPrEx>
         <w:tc>
           <w:tcPr>
             <w:tcW w:w="2000" w:type="dxa"/>
@@ -161,12 +155,6 @@
         </w:tc>
       </w:tr>
       <w:tr>
-        <w:tblPrEx>
-          <w:tblCellMar>
-            <w:top w:w="0" w:type="dxa"/>
-            <w:bottom w:w="0" w:type="dxa"/>
-          </w:tblCellMar>
-        </w:tblPrEx>
         <w:tc>
           <w:tcPr>
             <w:tcW w:w="2000" w:type="dxa"/>
@@ -234,12 +222,6 @@
         </w:tc>
       </w:tr>
       <w:tr>
-        <w:tblPrEx>
-          <w:tblCellMar>
-            <w:top w:w="0" w:type="dxa"/>
-            <w:bottom w:w="0" w:type="dxa"/>
-          </w:tblCellMar>
-        </w:tblPrEx>
         <w:tc>
           <w:tcPr>
             <w:tcW w:w="2000" w:type="dxa"/>
@@ -376,12 +358,6 @@
         <w:gridCol w:w="1600"/>
       </w:tblGrid>
       <w:tr>
-        <w:tblPrEx>
-          <w:tblCellMar>
-            <w:top w:w="0" w:type="dxa"/>
-            <w:bottom w:w="0" w:type="dxa"/>
-          </w:tblCellMar>
-        </w:tblPrEx>
         <w:tc>
           <w:tcPr>
             <w:tcW w:w="1560" w:type="dxa"/>
@@ -504,12 +480,6 @@
         </w:tc>
       </w:tr>
       <w:tr>
-        <w:tblPrEx>
-          <w:tblCellMar>
-            <w:top w:w="0" w:type="dxa"/>
-            <w:bottom w:w="0" w:type="dxa"/>
-          </w:tblCellMar>
-        </w:tblPrEx>
         <w:tc>
           <w:tcPr>
             <w:tcW w:w="1560" w:type="dxa"/>
@@ -566,14 +536,7 @@
                 <w:sz w:val="20"/>
                 <w:szCs w:val="20"/>
               </w:rPr>
-              <w:t>Participants</w:t>
-            </w:r>
-            <w:r>
-              <w:rPr>
-                <w:sz w:val="20"/>
-                <w:szCs w:val="20"/>
-              </w:rPr>
-              <w:t xml:space="preserve"> submit their selected use case(s) to Improving at least one week before the workshop. Improving reviews submissions and prepares tailored facilitation and recommendations.</w:t>
+              <w:t>Participants submit their selected use case(s) to Improving no later than 5 business days prior to the workshop date. Improving reviews submissions and prepares tailored facilitation and recommendations.</w:t>
             </w:r>
           </w:p>
         </w:tc>
@@ -639,12 +602,6 @@
         </w:tc>
       </w:tr>
       <w:tr>
-        <w:tblPrEx>
-          <w:tblCellMar>
-            <w:top w:w="0" w:type="dxa"/>
-            <w:bottom w:w="0" w:type="dxa"/>
-          </w:tblCellMar>
-        </w:tblPrEx>
         <w:tc>
           <w:tcPr>
             <w:tcW w:w="1560" w:type="dxa"/>
@@ -701,31 +658,40 @@
                 <w:sz w:val="20"/>
                 <w:szCs w:val="20"/>
               </w:rPr>
-              <w:t xml:space="preserve">Half-day working session at Improving's Plano office. Two Improving AI specialists in the room. Small group of Cardinal Health - </w:t>
-            </w:r>
-            <w:proofErr w:type="spellStart"/>
+              <w:t xml:space="preserve">Half-day working session at Improving's Plano office. Two Improving AI specialists in the room. Small group of </w:t>
+            </w:r>
+            <w:bookmarkStart w:id="0" w:name="OLE_LINK1"/>
             <w:r>
               <w:rPr>
                 <w:sz w:val="20"/>
                 <w:szCs w:val="20"/>
               </w:rPr>
-              <w:t>Sonexus</w:t>
-            </w:r>
-            <w:proofErr w:type="spellEnd"/>
+              <w:t xml:space="preserve">Cardinal Health - </w:t>
+            </w:r>
+            <w:proofErr w:type="spellStart"/>
             <w:r>
               <w:rPr>
                 <w:sz w:val="20"/>
                 <w:szCs w:val="20"/>
               </w:rPr>
-              <w:t xml:space="preserve"> leaders (recommended 6-8 max). Each participant works through their submitted use case. Improving moves between participants: building, configuring, and teaching as we go. Session closes with each </w:t>
-            </w:r>
+              <w:t>Sonexus</w:t>
+            </w:r>
+            <w:bookmarkEnd w:id="0"/>
+            <w:proofErr w:type="spellEnd"/>
             <w:r>
               <w:rPr>
                 <w:sz w:val="20"/>
                 <w:szCs w:val="20"/>
               </w:rPr>
+              <w:t xml:space="preserve"> leaders (recommended 6-8 max). Participants work through their submitted use cases. Improving moves between participants: building, configuring, and teaching as we go. Session closes with each participant having at least one </w:t>
+            </w:r>
+            <w:r>
+              <w:rPr>
+                <w:sz w:val="20"/>
+                <w:szCs w:val="20"/>
+              </w:rPr>
               <w:lastRenderedPageBreak/>
-              <w:t>participant having at least one working use case and clear next steps.</w:t>
+              <w:t>working use case and clear next steps.</w:t>
             </w:r>
           </w:p>
         </w:tc>
@@ -899,15 +865,7 @@
         <w:spacing w:after="160"/>
       </w:pPr>
       <w:r>
-        <w:t xml:space="preserve">This is what separates a productive working session from a wasted half-day. Each participant must submit at least </w:t>
-      </w:r>
-      <w:proofErr w:type="gramStart"/>
-      <w:r>
-        <w:t>one use</w:t>
-      </w:r>
-      <w:proofErr w:type="gramEnd"/>
-      <w:r>
-        <w:t xml:space="preserve"> case brief at least one week in advance. The brief doesn't need to be long. We need to know:</w:t>
+        <w:t>This is what separates a productive working session from a wasted half-day. Use case briefs must be submitted no later than 5 business days prior to the workshop date. The brief doesn't need to be long. We need to know:</w:t>
       </w:r>
     </w:p>
     <w:p>
@@ -960,6 +918,90 @@
       </w:pPr>
       <w:r>
         <w:t>Improving uses the pre-work period to prepare initial learning material for level-setting participants, guided exercises, and identify any technical blockers that would slow the session.</w:t>
+      </w:r>
+    </w:p>
+    <w:p>
+      <w:pPr>
+        <w:spacing w:after="160"/>
+      </w:pPr>
+      <w:r>
+        <w:t>To ensure the session delivers working outcomes, use case briefs must be submitted no later than 5 business days prior to the workshop date. This lead time allows our team to review each use case for technical feasibility, identify potential data access or permissions issues, and tailor facilitation accordingly. Use cases submitted after this deadline may not receive full preparation support and could impact session outcomes.</w:t>
+      </w:r>
+    </w:p>
+    <w:p>
+      <w:pPr>
+        <w:spacing w:after="160"/>
+      </w:pPr>
+      <w:r>
+        <w:t>Please note that issues arising on the day of the workshop, including data access restrictions, permissions gaps, or system connectivity problems, may impact our ability to deliver a fully working workflow within the session. In these cases, Improving will document the blockers and define a clear remediation path, but additional follow-on work may be required to reach a completed state. Resolving these issues in advance during the pre-work period is the best way to protect the session output.</w:t>
+      </w:r>
+    </w:p>
+    <w:p>
+      <w:pPr>
+        <w:pStyle w:val="Heading2"/>
+      </w:pPr>
+      <w:r>
+        <w:t>Planned Outcomes</w:t>
+      </w:r>
+    </w:p>
+    <w:p>
+      <w:pPr>
+        <w:spacing w:after="160"/>
+      </w:pPr>
+      <w:r>
+        <w:t xml:space="preserve">The goal of this workshop is not to produce a single polished automation. It is to move multiple use cases from concept to momentum. By the end of the session, </w:t>
+      </w:r>
+      <w:r>
+        <w:t>multiple</w:t>
+      </w:r>
+      <w:r>
+        <w:t xml:space="preserve"> submitted use case</w:t>
+      </w:r>
+      <w:r>
+        <w:t>s</w:t>
+      </w:r>
+      <w:r>
+        <w:t xml:space="preserve"> should have a working prototype or a clearly defined, actionable build path, giving </w:t>
+      </w:r>
+      <w:r>
+        <w:t xml:space="preserve">Cardinal Health – </w:t>
+      </w:r>
+      <w:proofErr w:type="spellStart"/>
+      <w:r>
+        <w:t>Sonexus</w:t>
+      </w:r>
+      <w:proofErr w:type="spellEnd"/>
+      <w:r>
+        <w:t xml:space="preserve"> tangible progress across several workflows rather than a single finished artifact.</w:t>
+      </w:r>
+    </w:p>
+    <w:p>
+      <w:pPr>
+        <w:spacing w:after="160"/>
+      </w:pPr>
+      <w:r>
+        <w:t>Participants leave with use cases that are outlined, configured, and</w:t>
+      </w:r>
+      <w:r>
+        <w:t>,</w:t>
+      </w:r>
+      <w:r>
+        <w:t xml:space="preserve"> in most cases</w:t>
+      </w:r>
+      <w:r>
+        <w:t>,</w:t>
+      </w:r>
+      <w:r>
+        <w:t xml:space="preserve"> running, representing real end-to-end value for the workflows that matter most to their teams. Where a use case is not fully completed within the session, Improving will document the remaining steps and any blockers so follow-on work can begin immediately.</w:t>
+      </w:r>
+    </w:p>
+    <w:p>
+      <w:pPr>
+        <w:spacing w:after="160"/>
+      </w:pPr>
+      <w:r>
+        <w:lastRenderedPageBreak/>
+        <w:t>This approach reflects how AI value actually compounds: not from one perfect workflow, but from multiple teams moving forward in parallel.</w:t>
       </w:r>
     </w:p>
     <w:p>
@@ -1005,12 +1047,6 @@
         <w:gridCol w:w="3000"/>
       </w:tblGrid>
       <w:tr>
-        <w:tblPrEx>
-          <w:tblCellMar>
-            <w:top w:w="0" w:type="dxa"/>
-            <w:bottom w:w="0" w:type="dxa"/>
-          </w:tblCellMar>
-        </w:tblPrEx>
         <w:tc>
           <w:tcPr>
             <w:tcW w:w="6360" w:type="dxa"/>
@@ -1076,12 +1112,6 @@
         </w:tc>
       </w:tr>
       <w:tr>
-        <w:tblPrEx>
-          <w:tblCellMar>
-            <w:top w:w="0" w:type="dxa"/>
-            <w:bottom w:w="0" w:type="dxa"/>
-          </w:tblCellMar>
-        </w:tblPrEx>
         <w:tc>
           <w:tcPr>
             <w:tcW w:w="6360" w:type="dxa"/>
@@ -1196,83 +1226,6 @@
       <w:r>
         <w:t xml:space="preserve"> into. The prompting-to-workflow gap, the tooling challenges, and the bandwidth constraint. We've got practical answers and are interested in helping move things forward.</w:t>
       </w:r>
-    </w:p>
-    <w:p>
-      <w:pPr>
-        <w:spacing w:after="200"/>
-      </w:pPr>
-    </w:p>
-    <w:p>
-      <w:pPr>
-        <w:pStyle w:val="Heading1"/>
-      </w:pPr>
-      <w:r>
-        <w:lastRenderedPageBreak/>
-        <w:t>Next Steps</w:t>
-      </w:r>
-    </w:p>
-    <w:p>
-      <w:pPr>
-        <w:spacing w:after="160"/>
-      </w:pPr>
-      <w:r>
-        <w:t>Here's what moves this forward:</w:t>
-      </w:r>
-    </w:p>
-    <w:p>
-      <w:pPr>
-        <w:spacing w:after="40"/>
-      </w:pPr>
-    </w:p>
-    <w:p>
-      <w:pPr>
-        <w:pStyle w:val="ListParagraph"/>
-        <w:numPr>
-          <w:ilvl w:val="0"/>
-          <w:numId w:val="2"/>
-        </w:numPr>
-        <w:spacing w:after="100"/>
-      </w:pPr>
-      <w:r>
-        <w:rPr>
-          <w:b/>
-          <w:bCs/>
-        </w:rPr>
-        <w:t xml:space="preserve">Confirm participation. </w:t>
-      </w:r>
-      <w:r>
-        <w:t>Finalize the attendee list (6-8 VP/GM-level leaders). We'll size the session and confirm two Improving specialists for the date.</w:t>
-      </w:r>
-    </w:p>
-    <w:p>
-      <w:pPr>
-        <w:pStyle w:val="ListParagraph"/>
-        <w:numPr>
-          <w:ilvl w:val="0"/>
-          <w:numId w:val="2"/>
-        </w:numPr>
-        <w:spacing w:after="100"/>
-      </w:pPr>
-      <w:r>
-        <w:rPr>
-          <w:b/>
-          <w:bCs/>
-        </w:rPr>
-        <w:t xml:space="preserve">Agree on a date. </w:t>
-      </w:r>
-      <w:r>
-        <w:t>We'll hold a date at our Plano facility. Pre-work briefs are due one week prior.</w:t>
-      </w:r>
-    </w:p>
-    <w:p>
-      <w:pPr>
-        <w:spacing w:after="120"/>
-      </w:pPr>
-    </w:p>
-    <w:p>
-      <w:pPr>
-        <w:spacing w:after="200"/>
-      </w:pPr>
     </w:p>
     <w:p>
       <w:pPr>

</xml_diff>